<commit_message>
feat: manage members from the committee's edit page
At the college's request, replacing the tick boxes on the assign preview.

- The edit page lists everyone on the committee with a Remove link, and
  has an Add a member form that goes through the usual preview.
- Removing issues a numbered relinquishment order and returns to the
  edit page. Nothing is erased: the role moves to past committees.
- 'Relinquish' is now worded 'Remove from committee' throughout.
- The relieve-in-the-same-order feature is removed entirely.

Co-Authored-By: Claude Opus 5.5 <noreply@anthropic.com>
</commit_message>
<xml_diff>
--- a/templates/demo/order_template_COMMITTEE.docx
+++ b/templates/demo/order_template_COMMITTEE.docx
@@ -285,60 +285,6 @@
         </w:tc>
       </w:tr>
     </w:tbl>
-    <w:p>
-      <w:r>
-        <w:rPr>
-          <w:b w:val="0"/>
-          <w:u w:val="none"/>
-        </w:rPr>
-        <w:t>{%p if relieved_list %}</w:t>
-      </w:r>
-    </w:p>
-    <w:p>
-      <w:r>
-        <w:rPr>
-          <w:b w:val="0"/>
-          <w:u w:val="none"/>
-        </w:rPr>
-        <w:t>The following stand relieved of their earlier duties with effect from {{ effective_date }}:</w:t>
-      </w:r>
-    </w:p>
-    <w:p>
-      <w:r>
-        <w:rPr>
-          <w:b w:val="0"/>
-          <w:u w:val="none"/>
-        </w:rPr>
-        <w:t>{%p for r in relieved_list %}</w:t>
-      </w:r>
-    </w:p>
-    <w:p>
-      <w:r>
-        <w:rPr>
-          <w:b w:val="0"/>
-          <w:u w:val="none"/>
-        </w:rPr>
-        <w:t>{{ r.name }} — {{ r.role }}, {{ r.committee }}</w:t>
-      </w:r>
-    </w:p>
-    <w:p>
-      <w:r>
-        <w:rPr>
-          <w:b w:val="0"/>
-          <w:u w:val="none"/>
-        </w:rPr>
-        <w:t>{%p endfor %}</w:t>
-      </w:r>
-    </w:p>
-    <w:p>
-      <w:r>
-        <w:rPr>
-          <w:b w:val="0"/>
-          <w:u w:val="none"/>
-        </w:rPr>
-        <w:t>{%p endif %}</w:t>
-      </w:r>
-    </w:p>
     <w:p>
       <w:r>
         <w:rPr>

</xml_diff>